<commit_message>
Nichirin Katana relic plate (DM-approved) wired into path docs and book
The Warrior of Breathing's signature weapon had no art anywhere in the
repo (only Candyfang existed). New plate in the house item style: dark
sun-forged steel on velvet, crimson ore edge in dawnlight, three breath
wisps (blood-red, river-blue, violet-black) so no door is presupposed.

Banked to assets/items/nichirin_katana.png, prompt preserved in
assets/gen_prompts/, manifest entry added. imgfloat wired into the
katana block; compendium volumes, the three v3 handouts, and
10_The_Compendium.pdf rebuilt (plate lands beside the stat block on
handout page 6).

Co-Authored-By: Claude Opus 4.8 <noreply@anthropic.com>
</commit_message>
<xml_diff>
--- a/characters/path_rewards/warrior_of_breathing_v3.docx
+++ b/characters/path_rewards/warrior_of_breathing_v3.docx
@@ -2225,6 +2225,52 @@
     </w:p>
     <w:p>
       <w:pPr>
+        <w:spacing w:after="0" w:before="0"/>
+      </w:pPr>
+      <w:r>
+        <w:drawing>
+          <wp:anchor xmlns:a="http://schemas.openxmlformats.org/drawingml/2006/main" behindDoc="0" distT="91440" distB="100584" distL="201600" distR="201600" simplePos="0" locked="0" layoutInCell="1" allowOverlap="0" relativeHeight="2">
+            <wp:simplePos x="0" y="0"/>
+            <wp:positionH relativeFrom="column">
+              <wp:align>right</wp:align>
+            </wp:positionH>
+            <wp:positionV relativeFrom="paragraph">
+              <wp:posOffset>0</wp:posOffset>
+            </wp:positionV>
+            <wp:extent cx="2194560" cy="2194560"/>
+            <wp:effectExtent l="0" t="0" r="0" b="0"/>
+            <wp:wrapSquare wrapText="bothSides"/>
+            <wp:docPr id="7" name="Picture 7"/>
+            <wp:cNvGraphicFramePr/>
+            <a:graphic xmlns:pic="http://schemas.openxmlformats.org/drawingml/2006/picture">
+              <a:graphicData uri="http://schemas.openxmlformats.org/drawingml/2006/picture">
+                <pic:pic>
+                  <pic:nvPicPr>
+                    <pic:cNvPr id="0" name="image.jpg"/>
+                    <pic:cNvPicPr/>
+                  </pic:nvPicPr>
+                  <pic:blipFill>
+                    <a:blip r:embed="rId16"/>
+                    <a:stretch>
+                      <a:fillRect/>
+                    </a:stretch>
+                  </pic:blipFill>
+                  <pic:spPr>
+                    <a:xfrm>
+                      <a:off x="0" y="0"/>
+                      <a:ext cx="2194560" cy="2194560"/>
+                    </a:xfrm>
+                    <a:prstGeom prst="rect"/>
+                  </pic:spPr>
+                </pic:pic>
+              </a:graphicData>
+            </a:graphic>
+          </wp:anchor>
+        </w:drawing>
+      </w:r>
+    </w:p>
+    <w:p>
+      <w:pPr>
         <w:spacing w:after="80"/>
       </w:pPr>
       <w:r>

</xml_diff>

<commit_message>
Whitespace pass on the Three Doors run
Killed the orphaned Kensei paragraph tail that stranded a near-empty
page (slimmer Nichirin float, tightened the blade block's redundant
trailing flavor, two-line trim to the rumor box and Candyfang aside)
and recut the Elaria closer to a square full-page showpiece (was a
half-empty 3:2 float). The run drops from 17 to 16 pages; remaining
short pages are deliberate rhythm (chapter turn, section end,
showpiece). Compendium, handouts, and book rebuilt.

Co-Authored-By: Claude Opus 4.8 <noreply@anthropic.com>
</commit_message>
<xml_diff>
--- a/characters/path_rewards/warrior_of_breathing_v3.docx
+++ b/characters/path_rewards/warrior_of_breathing_v3.docx
@@ -1970,7 +1970,7 @@
             <wp:positionV relativeFrom="paragraph">
               <wp:posOffset>0</wp:posOffset>
             </wp:positionV>
-            <wp:extent cx="2194560" cy="2194560"/>
+            <wp:extent cx="1737360" cy="1737360"/>
             <wp:effectExtent l="0" t="0" r="0" b="0"/>
             <wp:wrapSquare wrapText="bothSides"/>
             <wp:docPr id="7" name="Picture 7"/>
@@ -1991,7 +1991,7 @@
                   <pic:spPr>
                     <a:xfrm>
                       <a:off x="0" y="0"/>
-                      <a:ext cx="2194560" cy="2194560"/>
+                      <a:ext cx="1737360" cy="1737360"/>
                     </a:xfrm>
                     <a:prstGeom prst="rect"/>
                   </pic:spPr>
@@ -2194,7 +2194,7 @@
           <w:color w:val="222222"/>
           <w:sz w:val="18"/>
         </w:rPr>
-        <w:t>The katana is especially dangerous to creatures twisted by darkness, undeath, or planar corruption. It leaves wounds that glow faintly like banked embers, revealing that the creature has been marked by cleansing sunlight. The blade wounds the corruption, not the creature beneath. When a corrupted guardian falls to it, what breaks is the darkness.</w:t>
+        <w:t>The blade wounds the corruption, not the creature beneath; when a corrupted guardian falls to it, what breaks is the darkness.</w:t>
       </w:r>
     </w:p>
     <w:p>
@@ -2269,7 +2269,7 @@
           <w:color w:val="222222"/>
           <w:sz w:val="21"/>
         </w:rPr>
-        <w:t xml:space="preserve"> Old hunters claim a Nichirin blade can never be truly stolen: carried by the wrong hand, the steel stays cold and dull and will not take an edge. Whether that is true, or simply a story told to keep thieves honest, no one in living memory has dared find out.</w:t>
+        <w:t xml:space="preserve"> Old hunters claim a Nichirin blade can never be truly stolen: carried by the wrong hand, the steel stays cold and dull and will not take an edge. No one in living memory has dared find out.</w:t>
       </w:r>
     </w:p>
     <w:p>
@@ -2299,7 +2299,7 @@
           <w:color w:val="222222"/>
           <w:sz w:val="21"/>
         </w:rPr>
-        <w:t>When Stabby takes up a breathing form at Level 7, the Kensei's tricks retire with his old teacher's lessons. He loses Kensei's Shot (the bow's Bonus Action +1d4) and Agile Parry (his +2 AC after blade-and-fist turns), and the Repeating Longbow becomes simply a very good bow, no longer a Monk weapon. In exchange he gains a stance he can ignite every single fight, a First Form that turns his Bonus Action into a 3d8 + 5 strike with 15 feet of free movement, form gifts that work all day, and a road that grows with him to Level 17. He is trading a parry for a predator's gait, and he gains far more than he gives up. (And Candyfang, outshone by the Nichirin blade, needn't vanish: an heirloom at his belt, or one day, a gift worthy of a Bloodfang.)</w:t>
+        <w:t>When Stabby takes up a breathing form at Level 7, the Kensei's tricks retire with his old teacher's lessons: Kensei's Shot and Agile Parry go, and the Repeating Longbow becomes simply a very good bow. In exchange he gains a stance he can ignite every single fight, a First Form that turns his Bonus Action into a 3d8 + 5 strike with 15 feet of free movement, and a road that grows with him to Level 17. He is trading a parry for a predator's gait. (And Candyfang remains: an heirloom at his belt, or one day a gift worthy of a Bloodfang.)</w:t>
       </w:r>
     </w:p>
     <w:sectPr>

</xml_diff>